<commit_message>
Site updated: 2025-03-16 17:18:00
</commit_message>
<xml_diff>
--- a/kangyi.docx
+++ b/kangyi.docx
@@ -18,35 +18,13 @@
       <w:r>
         <w:rPr>
           <w:rFonts w:ascii="微软雅黑" w:eastAsia="微软雅黑" w:hAnsi="微软雅黑" w:cs="微软雅黑" w:hint="eastAsia"/>
-          <w:color w:val="A6A6A6" w:themeColor="background1" w:themeShade="A6"/>
-          <w:kern w:val="0"/>
-          <w:sz w:val="27"/>
-          <w:szCs w:val="27"/>
-          <w:shd w:val="clear" w:color="auto" w:fill="FFFFFF"/>
-        </w:rPr>
-        <w:t>（问候）</w:t>
-      </w:r>
-      <w:r>
-        <w:rPr>
-          <w:rFonts w:ascii="微软雅黑" w:eastAsia="微软雅黑" w:hAnsi="微软雅黑" w:cs="微软雅黑" w:hint="eastAsia"/>
-          <w:color w:val="1A1A1A"/>
-          <w:kern w:val="0"/>
-          <w:sz w:val="27"/>
-          <w:szCs w:val="27"/>
-          <w:shd w:val="clear" w:color="auto" w:fill="FFFFFF"/>
-        </w:rPr>
-        <w:t>大家好，。。。（凭自己习惯加）</w:t>
-      </w:r>
-      <w:r>
-        <w:rPr>
-          <w:rFonts w:ascii="微软雅黑" w:eastAsia="微软雅黑" w:hAnsi="微软雅黑" w:cs="微软雅黑" w:hint="eastAsia"/>
-          <w:color w:val="1A1A1A"/>
-          <w:kern w:val="0"/>
-          <w:sz w:val="32"/>
-          <w:szCs w:val="32"/>
-          <w:shd w:val="clear" w:color="auto" w:fill="FFFFFF"/>
-        </w:rPr>
-        <w:t>。</w:t>
+          <w:color w:val="1A1A1A"/>
+          <w:kern w:val="0"/>
+          <w:sz w:val="27"/>
+          <w:szCs w:val="27"/>
+          <w:shd w:val="clear" w:color="auto" w:fill="FFFFFF"/>
+        </w:rPr>
+        <w:t>大家好</w:t>
       </w:r>
     </w:p>
     <w:p>
@@ -54,136 +32,12 @@
         <w:spacing w:beforeLines="50" w:before="156"/>
         <w:ind w:firstLine="200"/>
         <w:rPr>
-          <w:rFonts w:ascii="方正黑体简体" w:eastAsia="方正黑体简体" w:hAnsi="方正黑体简体" w:hint="eastAsia"/>
-          <w:sz w:val="22"/>
-        </w:rPr>
-      </w:pPr>
-      <w:r>
-        <w:rPr>
-          <w:rFonts w:ascii="方正黑体简体" w:eastAsia="方正黑体简体" w:hAnsi="方正黑体简体" w:hint="eastAsia"/>
-          <w:sz w:val="22"/>
-        </w:rPr>
-        <w:t>（如：</w:t>
-      </w:r>
-      <w:r>
-        <w:rPr>
-          <w:rFonts w:ascii="方正黑体简体" w:eastAsia="方正黑体简体" w:hAnsi="方正黑体简体" w:hint="eastAsia"/>
-          <w:sz w:val="22"/>
-        </w:rPr>
-        <w:t>今天我要分享的是中国精神中的抗</w:t>
-      </w:r>
-      <w:proofErr w:type="gramStart"/>
-      <w:r>
-        <w:rPr>
-          <w:rFonts w:ascii="方正黑体简体" w:eastAsia="方正黑体简体" w:hAnsi="方正黑体简体" w:hint="eastAsia"/>
-          <w:sz w:val="22"/>
-        </w:rPr>
-        <w:t>疫</w:t>
-      </w:r>
-      <w:proofErr w:type="gramEnd"/>
-      <w:r>
-        <w:rPr>
-          <w:rFonts w:ascii="方正黑体简体" w:eastAsia="方正黑体简体" w:hAnsi="方正黑体简体" w:hint="eastAsia"/>
-          <w:sz w:val="22"/>
-        </w:rPr>
-        <w:t>精神。</w:t>
-      </w:r>
-      <w:r>
-        <w:rPr>
-          <w:rFonts w:ascii="方正黑体简体" w:eastAsia="方正黑体简体" w:hAnsi="方正黑体简体" w:hint="eastAsia"/>
-          <w:sz w:val="22"/>
-        </w:rPr>
-        <w:t>大家可能不知道抗</w:t>
-      </w:r>
-      <w:proofErr w:type="gramStart"/>
-      <w:r>
-        <w:rPr>
-          <w:rFonts w:ascii="方正黑体简体" w:eastAsia="方正黑体简体" w:hAnsi="方正黑体简体" w:hint="eastAsia"/>
-          <w:sz w:val="22"/>
-        </w:rPr>
-        <w:t>疫</w:t>
-      </w:r>
-      <w:proofErr w:type="gramEnd"/>
-      <w:r>
-        <w:rPr>
-          <w:rFonts w:ascii="方正黑体简体" w:eastAsia="方正黑体简体" w:hAnsi="方正黑体简体" w:hint="eastAsia"/>
-          <w:sz w:val="22"/>
-        </w:rPr>
-        <w:t>精神的内涵，</w:t>
-      </w:r>
-      <w:r>
-        <w:rPr>
-          <w:rFonts w:ascii="方正黑体简体" w:eastAsia="方正黑体简体" w:hAnsi="方正黑体简体" w:hint="eastAsia"/>
-          <w:sz w:val="22"/>
-        </w:rPr>
-        <w:t>我</w:t>
-      </w:r>
-      <w:r>
-        <w:rPr>
-          <w:rFonts w:ascii="方正黑体简体" w:eastAsia="方正黑体简体" w:hAnsi="方正黑体简体" w:hint="eastAsia"/>
-          <w:sz w:val="22"/>
-        </w:rPr>
-        <w:t>给大家看一下</w:t>
-      </w:r>
-      <w:r>
-        <w:rPr>
-          <w:rFonts w:ascii="方正黑体简体" w:eastAsia="方正黑体简体" w:hAnsi="方正黑体简体"/>
-          <w:sz w:val="22"/>
-        </w:rPr>
-        <w:t>…</w:t>
-      </w:r>
-      <w:r>
-        <w:rPr>
-          <w:rFonts w:ascii="方正黑体简体" w:eastAsia="方正黑体简体" w:hAnsi="方正黑体简体" w:hint="eastAsia"/>
-          <w:sz w:val="22"/>
-        </w:rPr>
-        <w:t>..）</w:t>
-      </w:r>
-    </w:p>
-    <w:p>
-      <w:pPr>
-        <w:spacing w:beforeLines="50" w:before="156"/>
-        <w:ind w:firstLine="200"/>
-        <w:rPr>
-          <w:rFonts w:ascii="微软雅黑" w:eastAsia="微软雅黑" w:hAnsi="微软雅黑" w:cs="微软雅黑" w:hint="eastAsia"/>
-          <w:color w:val="A6A6A6" w:themeColor="background1" w:themeShade="A6"/>
-          <w:kern w:val="0"/>
-          <w:sz w:val="27"/>
-          <w:szCs w:val="27"/>
-          <w:shd w:val="clear" w:color="auto" w:fill="FFFFFF"/>
-        </w:rPr>
-      </w:pPr>
-      <w:r>
-        <w:rPr>
-          <w:rFonts w:ascii="微软雅黑" w:eastAsia="微软雅黑" w:hAnsi="微软雅黑" w:cs="微软雅黑" w:hint="eastAsia"/>
-          <w:color w:val="A6A6A6" w:themeColor="background1" w:themeShade="A6"/>
-          <w:kern w:val="0"/>
-          <w:sz w:val="27"/>
-          <w:szCs w:val="27"/>
-          <w:shd w:val="clear" w:color="auto" w:fill="FFFFFF"/>
-        </w:rPr>
-        <w:t>（点击ppt）</w:t>
-      </w:r>
-    </w:p>
-    <w:p>
-      <w:pPr>
-        <w:spacing w:beforeLines="50" w:before="156"/>
-        <w:ind w:firstLine="200"/>
-        <w:rPr>
           <w:sz w:val="28"/>
           <w:szCs w:val="28"/>
         </w:rPr>
       </w:pPr>
       <w:r>
         <w:rPr>
-          <w:rFonts w:hint="eastAsia"/>
-          <w:sz w:val="28"/>
-          <w:szCs w:val="28"/>
-        </w:rPr>
-        <w:t xml:space="preserve"> </w:t>
-      </w:r>
-      <w:r>
-        <w:rPr>
           <w:rFonts w:ascii="微软雅黑" w:eastAsia="微软雅黑" w:hAnsi="微软雅黑" w:cs="微软雅黑" w:hint="eastAsia"/>
           <w:color w:val="1A1A1A"/>
           <w:kern w:val="0"/>
@@ -193,16 +47,6 @@
         </w:rPr>
         <w:t>生命至上、举国同心、舍生忘死、尊重科学、命运与共。</w:t>
       </w:r>
-    </w:p>
-    <w:p>
-      <w:pPr>
-        <w:spacing w:beforeLines="50" w:before="156"/>
-        <w:ind w:firstLine="200"/>
-        <w:rPr>
-          <w:sz w:val="28"/>
-          <w:szCs w:val="28"/>
-        </w:rPr>
-      </w:pPr>
       <w:r>
         <w:rPr>
           <w:rFonts w:ascii="微软雅黑" w:eastAsia="微软雅黑" w:hAnsi="微软雅黑" w:cs="微软雅黑" w:hint="eastAsia"/>
@@ -281,7 +125,7 @@
           <w:szCs w:val="27"/>
           <w:shd w:val="clear" w:color="auto" w:fill="FFFFFF"/>
         </w:rPr>
-        <w:t>此次疫情是第二次世界大战结束以来最严重的全球公共卫生突发事件。面对前所未见、突如其来的新冠肺炎疫情，千万人口大市、九省通衢之地关闭离汉通道；4万余名医务人员白衣执甲，星夜驰援；14亿中国人信心坚定，众志成城……这是人类历史上最勇敢的防控措施，也是前所未有的主动牺牲。</w:t>
+        <w:t>此次疫情是第二次世界大战结束以来最严重的全球公共卫生突发事件。面对前所未见疫情，千万人口大市、九省通衢之地关闭离汉通道；4万余名医务人员白衣执甲，星夜驰援；14亿中国人信心坚定，众志成城……这是人类历史上最勇敢的防控措施，也是前所未有的主动牺牲。</w:t>
       </w:r>
     </w:p>
     <w:p>
@@ -301,12 +145,12 @@
       <w:r>
         <w:rPr>
           <w:rFonts w:ascii="微软雅黑" w:eastAsia="微软雅黑" w:hAnsi="微软雅黑" w:cs="微软雅黑" w:hint="eastAsia"/>
-          <w:color w:val="A6A6A6" w:themeColor="background1" w:themeShade="A6"/>
-          <w:sz w:val="27"/>
-          <w:szCs w:val="27"/>
-          <w:shd w:val="clear" w:color="auto" w:fill="FFFFFF"/>
-        </w:rPr>
-        <w:t>(点击ppt)</w:t>
+          <w:color w:val="1A1A1A"/>
+          <w:sz w:val="27"/>
+          <w:szCs w:val="27"/>
+          <w:shd w:val="clear" w:color="auto" w:fill="FFFFFF"/>
+        </w:rPr>
+        <w:t>跨越冬与春，经历死与生。在党中央坚强领导下，中国以坚决果断的勇气和决心，采取前所未有科学精准的防控策略和措施，经过艰苦卓绝努力，用一个多月的时间初步遏制了疫情蔓延势头，用两个月左右的时间将本土每日新增病例控制在个位数以内，用三个月左右的时间取得了武汉保卫战、湖北保卫战的决定性成果，疫情防控阻击战取得重大战略成果。中国人民挺过来了。</w:t>
       </w:r>
     </w:p>
     <w:p>
@@ -317,21 +161,52 @@
         <w:jc w:val="both"/>
         <w:rPr>
           <w:rFonts w:ascii="微软雅黑" w:eastAsia="微软雅黑" w:hAnsi="微软雅黑" w:cs="微软雅黑" w:hint="eastAsia"/>
+          <w:color w:val="333333"/>
+          <w:sz w:val="27"/>
+          <w:szCs w:val="27"/>
+        </w:rPr>
+      </w:pPr>
+      <w:r>
+        <w:rPr>
+          <w:rFonts w:ascii="微软雅黑" w:eastAsia="微软雅黑" w:hAnsi="微软雅黑" w:cs="微软雅黑" w:hint="eastAsia"/>
+          <w:color w:val="1A1A1A"/>
+          <w:sz w:val="27"/>
+          <w:szCs w:val="27"/>
+          <w:shd w:val="clear" w:color="auto" w:fill="FFFFFF"/>
+        </w:rPr>
+        <w:t>还记得抗</w:t>
+      </w:r>
+      <w:proofErr w:type="gramStart"/>
+      <w:r>
+        <w:rPr>
+          <w:rFonts w:ascii="微软雅黑" w:eastAsia="微软雅黑" w:hAnsi="微软雅黑" w:cs="微软雅黑" w:hint="eastAsia"/>
+          <w:color w:val="1A1A1A"/>
+          <w:sz w:val="27"/>
+          <w:szCs w:val="27"/>
+          <w:shd w:val="clear" w:color="auto" w:fill="FFFFFF"/>
+        </w:rPr>
+        <w:t>疫</w:t>
+      </w:r>
+      <w:proofErr w:type="gramEnd"/>
+      <w:r>
+        <w:rPr>
+          <w:rFonts w:ascii="微软雅黑" w:eastAsia="微软雅黑" w:hAnsi="微软雅黑" w:cs="微软雅黑" w:hint="eastAsia"/>
+          <w:color w:val="1A1A1A"/>
+          <w:sz w:val="27"/>
+          <w:szCs w:val="27"/>
+          <w:shd w:val="clear" w:color="auto" w:fill="FFFFFF"/>
+        </w:rPr>
+        <w:t>精神的内涵吗？生命至上、举国同心、舍生忘死、尊重科学、命运与共。</w:t>
+      </w:r>
+      <w:r>
+        <w:rPr>
+          <w:rFonts w:ascii="微软雅黑" w:eastAsia="微软雅黑" w:hAnsi="微软雅黑" w:cs="微软雅黑" w:hint="eastAsia"/>
           <w:color w:val="A6A6A6" w:themeColor="background1" w:themeShade="A6"/>
           <w:sz w:val="27"/>
           <w:szCs w:val="27"/>
           <w:shd w:val="clear" w:color="auto" w:fill="FFFFFF"/>
         </w:rPr>
-      </w:pPr>
-      <w:r>
-        <w:rPr>
-          <w:rFonts w:ascii="微软雅黑" w:eastAsia="微软雅黑" w:hAnsi="微软雅黑" w:cs="微软雅黑" w:hint="eastAsia"/>
-          <w:color w:val="A6A6A6" w:themeColor="background1" w:themeShade="A6"/>
-          <w:sz w:val="27"/>
-          <w:szCs w:val="27"/>
-          <w:shd w:val="clear" w:color="auto" w:fill="FFFFFF"/>
-        </w:rPr>
-        <w:t>(稍停顿，再次点击ppt)</w:t>
+        <w:t>(点击ppt开始讲)</w:t>
       </w:r>
     </w:p>
     <w:p>
@@ -366,71 +241,7 @@
           <w:szCs w:val="27"/>
           <w:shd w:val="clear" w:color="auto" w:fill="FFFFFF"/>
         </w:rPr>
-        <w:t>跨越冬与春，经历死与生。在以习近平同志为核心的党中央坚强领导下，中国以坚决果断的勇气和决心，采取前所未有科学精准的防控策略和措施，经过艰苦卓绝努力，用一个多月的时间初步遏制了疫情蔓延势头，用两个月左右的时间将本土每日新增病例控制在个位数以内，用三个月左右的时间取</w:t>
-      </w:r>
-      <w:r>
-        <w:rPr>
-          <w:rFonts w:ascii="微软雅黑" w:eastAsia="微软雅黑" w:hAnsi="微软雅黑" w:cs="微软雅黑" w:hint="eastAsia"/>
-          <w:color w:val="1A1A1A"/>
-          <w:sz w:val="27"/>
-          <w:szCs w:val="27"/>
-          <w:shd w:val="clear" w:color="auto" w:fill="FFFFFF"/>
-        </w:rPr>
-        <w:lastRenderedPageBreak/>
-        <w:t>得了武汉保卫战、湖北保卫战的决定性成果，疫情防控阻击战取得重大战略成果。中国人民挺过来了。</w:t>
-      </w:r>
-    </w:p>
-    <w:p>
-      <w:pPr>
-        <w:spacing w:beforeLines="50" w:before="156"/>
-        <w:ind w:firstLine="200"/>
-        <w:rPr>
-          <w:rFonts w:ascii="方正黑体简体" w:eastAsia="方正黑体简体" w:hAnsi="方正黑体简体" w:hint="eastAsia"/>
-          <w:sz w:val="44"/>
-          <w:szCs w:val="44"/>
-        </w:rPr>
-      </w:pPr>
-      <w:r>
-        <w:rPr>
-          <w:rFonts w:ascii="方正黑体简体" w:eastAsia="方正黑体简体" w:hAnsi="方正黑体简体" w:hint="eastAsia"/>
-          <w:sz w:val="44"/>
-          <w:szCs w:val="44"/>
-        </w:rPr>
-        <w:t xml:space="preserve">第二部分 </w:t>
-      </w:r>
-      <w:r>
-        <w:rPr>
-          <w:rFonts w:ascii="方正黑体简体" w:eastAsia="方正黑体简体" w:hAnsi="方正黑体简体"/>
-          <w:sz w:val="44"/>
-          <w:szCs w:val="44"/>
-        </w:rPr>
-        <w:t xml:space="preserve"> </w:t>
-      </w:r>
-      <w:r>
-        <w:rPr>
-          <w:rFonts w:ascii="方正黑体简体" w:eastAsia="方正黑体简体" w:hAnsi="方正黑体简体" w:hint="eastAsia"/>
-          <w:sz w:val="44"/>
-          <w:szCs w:val="44"/>
-        </w:rPr>
-        <w:t>伟大抗</w:t>
-      </w:r>
-      <w:proofErr w:type="gramStart"/>
-      <w:r>
-        <w:rPr>
-          <w:rFonts w:ascii="方正黑体简体" w:eastAsia="方正黑体简体" w:hAnsi="方正黑体简体" w:hint="eastAsia"/>
-          <w:sz w:val="44"/>
-          <w:szCs w:val="44"/>
-        </w:rPr>
-        <w:t>疫</w:t>
-      </w:r>
-      <w:proofErr w:type="gramEnd"/>
-      <w:r>
-        <w:rPr>
-          <w:rFonts w:ascii="方正黑体简体" w:eastAsia="方正黑体简体" w:hAnsi="方正黑体简体" w:hint="eastAsia"/>
-          <w:sz w:val="44"/>
-          <w:szCs w:val="44"/>
-        </w:rPr>
-        <w:t>精神解析</w:t>
+        <w:t>——生命至上，集中体现了中国人民深厚的仁爱传统和中国共产党人以人民为中心的价值追求。人的生命是最宝贵的，生命只有一次，失去不会再来。中国不惜一切代价保护人民生命安全。</w:t>
       </w:r>
     </w:p>
     <w:p>
@@ -441,62 +252,42 @@
         <w:jc w:val="both"/>
         <w:rPr>
           <w:rFonts w:ascii="微软雅黑" w:eastAsia="微软雅黑" w:hAnsi="微软雅黑" w:cs="微软雅黑" w:hint="eastAsia"/>
-          <w:color w:val="333333"/>
-          <w:sz w:val="27"/>
-          <w:szCs w:val="27"/>
+          <w:color w:val="1A1A1A"/>
+          <w:sz w:val="27"/>
+          <w:szCs w:val="27"/>
+          <w:shd w:val="clear" w:color="auto" w:fill="FFFFFF"/>
         </w:rPr>
       </w:pPr>
       <w:r>
         <w:rPr>
           <w:rFonts w:ascii="微软雅黑" w:eastAsia="微软雅黑" w:hAnsi="微软雅黑" w:cs="微软雅黑" w:hint="eastAsia"/>
-          <w:color w:val="333333"/>
-          <w:sz w:val="27"/>
-          <w:szCs w:val="27"/>
-          <w:shd w:val="clear" w:color="auto" w:fill="FFFFFF"/>
-        </w:rPr>
-        <w:t xml:space="preserve">　</w:t>
-      </w:r>
-      <w:r>
-        <w:rPr>
-          <w:rFonts w:ascii="微软雅黑" w:eastAsia="微软雅黑" w:hAnsi="微软雅黑" w:cs="微软雅黑" w:hint="eastAsia"/>
-          <w:color w:val="1A1A1A"/>
-          <w:sz w:val="27"/>
-          <w:szCs w:val="27"/>
-          <w:shd w:val="clear" w:color="auto" w:fill="FFFFFF"/>
-        </w:rPr>
-        <w:t>还记得抗</w:t>
-      </w:r>
-      <w:proofErr w:type="gramStart"/>
-      <w:r>
-        <w:rPr>
-          <w:rFonts w:ascii="微软雅黑" w:eastAsia="微软雅黑" w:hAnsi="微软雅黑" w:cs="微软雅黑" w:hint="eastAsia"/>
-          <w:color w:val="1A1A1A"/>
-          <w:sz w:val="27"/>
-          <w:szCs w:val="27"/>
-          <w:shd w:val="clear" w:color="auto" w:fill="FFFFFF"/>
-        </w:rPr>
-        <w:t>疫</w:t>
-      </w:r>
-      <w:proofErr w:type="gramEnd"/>
-      <w:r>
-        <w:rPr>
-          <w:rFonts w:ascii="微软雅黑" w:eastAsia="微软雅黑" w:hAnsi="微软雅黑" w:cs="微软雅黑" w:hint="eastAsia"/>
-          <w:color w:val="1A1A1A"/>
-          <w:sz w:val="27"/>
-          <w:szCs w:val="27"/>
-          <w:shd w:val="clear" w:color="auto" w:fill="FFFFFF"/>
-        </w:rPr>
-        <w:t>精神的内涵吗？生命至上、举国同心、舍生忘死、尊重科学、命运与共。</w:t>
-      </w:r>
-      <w:r>
-        <w:rPr>
-          <w:rFonts w:ascii="微软雅黑" w:eastAsia="微软雅黑" w:hAnsi="微软雅黑" w:cs="微软雅黑" w:hint="eastAsia"/>
-          <w:color w:val="A6A6A6" w:themeColor="background1" w:themeShade="A6"/>
-          <w:sz w:val="27"/>
-          <w:szCs w:val="27"/>
-          <w:shd w:val="clear" w:color="auto" w:fill="FFFFFF"/>
-        </w:rPr>
-        <w:t>(点击ppt开始讲)</w:t>
+          <w:color w:val="1A1A1A"/>
+          <w:sz w:val="27"/>
+          <w:szCs w:val="27"/>
+          <w:shd w:val="clear" w:color="auto" w:fill="FFFFFF"/>
+        </w:rPr>
+        <w:lastRenderedPageBreak/>
+        <w:t xml:space="preserve">　　——举国同心，集中体现了中国人民万众一心、同甘共苦的团结伟力。面对生死考验，面对长时间隔离带来的巨大身心压力，广大人民群众生死较量不畏惧、千难万险不退缩</w:t>
+      </w:r>
+      <w:r>
+        <w:rPr>
+          <w:rFonts w:ascii="微软雅黑" w:eastAsia="微软雅黑" w:hAnsi="微软雅黑" w:cs="微软雅黑" w:hint="eastAsia"/>
+          <w:color w:val="1A1A1A"/>
+          <w:sz w:val="27"/>
+          <w:szCs w:val="27"/>
+          <w:shd w:val="clear" w:color="auto" w:fill="FFFFFF"/>
+        </w:rPr>
+        <w:t>。</w:t>
+      </w:r>
+      <w:r>
+        <w:rPr>
+          <w:rFonts w:ascii="微软雅黑" w:eastAsia="微软雅黑" w:hAnsi="微软雅黑" w:cs="微软雅黑" w:hint="eastAsia"/>
+          <w:color w:val="1A1A1A"/>
+          <w:sz w:val="27"/>
+          <w:szCs w:val="27"/>
+          <w:shd w:val="clear" w:color="auto" w:fill="FFFFFF"/>
+        </w:rPr>
+        <w:t>14亿中国人民同呼吸、共命运，肩并肩、心连心，绘就了团结就是力量的时代画卷！</w:t>
       </w:r>
     </w:p>
     <w:p>
@@ -516,22 +307,78 @@
       <w:r>
         <w:rPr>
           <w:rFonts w:ascii="微软雅黑" w:eastAsia="微软雅黑" w:hAnsi="微软雅黑" w:cs="微软雅黑" w:hint="eastAsia"/>
-          <w:color w:val="333333"/>
-          <w:sz w:val="27"/>
-          <w:szCs w:val="27"/>
-          <w:shd w:val="clear" w:color="auto" w:fill="FFFFFF"/>
-        </w:rPr>
-        <w:t xml:space="preserve">　　</w:t>
-      </w:r>
-      <w:r>
-        <w:rPr>
-          <w:rFonts w:ascii="微软雅黑" w:eastAsia="微软雅黑" w:hAnsi="微软雅黑" w:cs="微软雅黑" w:hint="eastAsia"/>
-          <w:color w:val="1A1A1A"/>
-          <w:sz w:val="27"/>
-          <w:szCs w:val="27"/>
-          <w:shd w:val="clear" w:color="auto" w:fill="FFFFFF"/>
-        </w:rPr>
-        <w:t>——生命至上，集中体现了中国人民深厚的仁爱传统和中国共产党人以人民为中心的价值追求。“爱人利物之谓仁。”疫情无情人有情。人的生命是最宝贵的，生命只有一次，失去不会再来。中国不惜一切代价保护人民生命安全面前。从出生仅30多个小时的婴儿到100多岁的老人，从在华外国留学生到来华外国人员，每一个生命都得到全力护佑，这是党执政为民理念的最好诠释！这是中华文明人命关天的道德观念的最好体现！这也是中国人民敬仰生命的人文精神的最好印证！</w:t>
+          <w:color w:val="1A1A1A"/>
+          <w:sz w:val="27"/>
+          <w:szCs w:val="27"/>
+          <w:shd w:val="clear" w:color="auto" w:fill="FFFFFF"/>
+        </w:rPr>
+        <w:t xml:space="preserve">　　——舍生忘死，集中体现了中国人民敢于压倒一切困难而不被任何困难所压倒的顽强意志。各条战线的抗</w:t>
+      </w:r>
+      <w:proofErr w:type="gramStart"/>
+      <w:r>
+        <w:rPr>
+          <w:rFonts w:ascii="微软雅黑" w:eastAsia="微软雅黑" w:hAnsi="微软雅黑" w:cs="微软雅黑" w:hint="eastAsia"/>
+          <w:color w:val="1A1A1A"/>
+          <w:sz w:val="27"/>
+          <w:szCs w:val="27"/>
+          <w:shd w:val="clear" w:color="auto" w:fill="FFFFFF"/>
+        </w:rPr>
+        <w:t>疫</w:t>
+      </w:r>
+      <w:proofErr w:type="gramEnd"/>
+      <w:r>
+        <w:rPr>
+          <w:rFonts w:ascii="微软雅黑" w:eastAsia="微软雅黑" w:hAnsi="微软雅黑" w:cs="微软雅黑" w:hint="eastAsia"/>
+          <w:color w:val="1A1A1A"/>
+          <w:sz w:val="27"/>
+          <w:szCs w:val="27"/>
+          <w:shd w:val="clear" w:color="auto" w:fill="FFFFFF"/>
+        </w:rPr>
+        <w:t>勇士临危不惧、视死如归，困难面前</w:t>
+      </w:r>
+      <w:proofErr w:type="gramStart"/>
+      <w:r>
+        <w:rPr>
+          <w:rFonts w:ascii="微软雅黑" w:eastAsia="微软雅黑" w:hAnsi="微软雅黑" w:cs="微软雅黑" w:hint="eastAsia"/>
+          <w:color w:val="1A1A1A"/>
+          <w:sz w:val="27"/>
+          <w:szCs w:val="27"/>
+          <w:shd w:val="clear" w:color="auto" w:fill="FFFFFF"/>
+        </w:rPr>
+        <w:t>豁</w:t>
+      </w:r>
+      <w:proofErr w:type="gramEnd"/>
+      <w:r>
+        <w:rPr>
+          <w:rFonts w:ascii="微软雅黑" w:eastAsia="微软雅黑" w:hAnsi="微软雅黑" w:cs="微软雅黑" w:hint="eastAsia"/>
+          <w:color w:val="1A1A1A"/>
+          <w:sz w:val="27"/>
+          <w:szCs w:val="27"/>
+          <w:shd w:val="clear" w:color="auto" w:fill="FFFFFF"/>
+        </w:rPr>
+        <w:t>得出、关键时刻冲得上，以</w:t>
+      </w:r>
+      <w:proofErr w:type="gramStart"/>
+      <w:r>
+        <w:rPr>
+          <w:rFonts w:ascii="微软雅黑" w:eastAsia="微软雅黑" w:hAnsi="微软雅黑" w:cs="微软雅黑" w:hint="eastAsia"/>
+          <w:color w:val="1A1A1A"/>
+          <w:sz w:val="27"/>
+          <w:szCs w:val="27"/>
+          <w:shd w:val="clear" w:color="auto" w:fill="FFFFFF"/>
+        </w:rPr>
+        <w:t>生命赴使命</w:t>
+      </w:r>
+      <w:proofErr w:type="gramEnd"/>
+      <w:r>
+        <w:rPr>
+          <w:rFonts w:ascii="微软雅黑" w:eastAsia="微软雅黑" w:hAnsi="微软雅黑" w:cs="微软雅黑" w:hint="eastAsia"/>
+          <w:color w:val="1A1A1A"/>
+          <w:sz w:val="27"/>
+          <w:szCs w:val="27"/>
+          <w:shd w:val="clear" w:color="auto" w:fill="FFFFFF"/>
+        </w:rPr>
+        <w:t>，用大爱护众生。中华民族能够经历无数灾厄仍不断发展壮大，从来都不是因为有救世主，而是因为在大灾大难前有千千万万个普通人挺身而出、慷慨前行！</w:t>
       </w:r>
     </w:p>
     <w:p>
@@ -556,146 +403,7 @@
           <w:szCs w:val="27"/>
           <w:shd w:val="clear" w:color="auto" w:fill="FFFFFF"/>
         </w:rPr>
-        <w:t xml:space="preserve">　　——举国同心，集中体现了中国人民万众一心、同甘共苦的团结伟力。面对生死考验，面对长时间隔离带来的巨大身心压力，广大人民群众生死较量不畏惧、千难万险不退缩，</w:t>
-      </w:r>
-      <w:proofErr w:type="gramStart"/>
-      <w:r>
-        <w:rPr>
-          <w:rFonts w:ascii="微软雅黑" w:eastAsia="微软雅黑" w:hAnsi="微软雅黑" w:cs="微软雅黑" w:hint="eastAsia"/>
-          <w:color w:val="1A1A1A"/>
-          <w:sz w:val="27"/>
-          <w:szCs w:val="27"/>
-          <w:shd w:val="clear" w:color="auto" w:fill="FFFFFF"/>
-        </w:rPr>
-        <w:t>或向险而</w:t>
-      </w:r>
-      <w:proofErr w:type="gramEnd"/>
-      <w:r>
-        <w:rPr>
-          <w:rFonts w:ascii="微软雅黑" w:eastAsia="微软雅黑" w:hAnsi="微软雅黑" w:cs="微软雅黑" w:hint="eastAsia"/>
-          <w:color w:val="1A1A1A"/>
-          <w:sz w:val="27"/>
-          <w:szCs w:val="27"/>
-          <w:shd w:val="clear" w:color="auto" w:fill="FFFFFF"/>
-        </w:rPr>
-        <w:t>行，或默默坚守，以各种方式为疫情防控操心出力。长城内外、大江南北，誓言铿锵，丹心闪耀。14亿中国人民同呼吸、共命运，肩并肩、心连心，绘就了团结就是力量的时代画卷！</w:t>
-      </w:r>
-    </w:p>
-    <w:p>
-      <w:pPr>
-        <w:pStyle w:val="a3"/>
-        <w:shd w:val="clear" w:color="auto" w:fill="FFFFFF"/>
-        <w:spacing w:beforeLines="50" w:before="156" w:beforeAutospacing="0" w:after="0" w:afterAutospacing="0" w:line="630" w:lineRule="atLeast"/>
-        <w:jc w:val="both"/>
-        <w:rPr>
-          <w:rFonts w:ascii="微软雅黑" w:eastAsia="微软雅黑" w:hAnsi="微软雅黑" w:cs="微软雅黑" w:hint="eastAsia"/>
-          <w:color w:val="1A1A1A"/>
-          <w:sz w:val="27"/>
-          <w:szCs w:val="27"/>
-          <w:shd w:val="clear" w:color="auto" w:fill="FFFFFF"/>
-        </w:rPr>
-      </w:pPr>
-      <w:r>
-        <w:rPr>
-          <w:rFonts w:ascii="微软雅黑" w:eastAsia="微软雅黑" w:hAnsi="微软雅黑" w:cs="微软雅黑" w:hint="eastAsia"/>
-          <w:color w:val="1A1A1A"/>
-          <w:sz w:val="27"/>
-          <w:szCs w:val="27"/>
-          <w:shd w:val="clear" w:color="auto" w:fill="FFFFFF"/>
-        </w:rPr>
-        <w:lastRenderedPageBreak/>
-        <w:t xml:space="preserve">　　——舍生忘死，集中体现了中国人民敢于压倒一切困难而不被任何困难所压倒的顽强意志。各条战线的抗</w:t>
-      </w:r>
-      <w:proofErr w:type="gramStart"/>
-      <w:r>
-        <w:rPr>
-          <w:rFonts w:ascii="微软雅黑" w:eastAsia="微软雅黑" w:hAnsi="微软雅黑" w:cs="微软雅黑" w:hint="eastAsia"/>
-          <w:color w:val="1A1A1A"/>
-          <w:sz w:val="27"/>
-          <w:szCs w:val="27"/>
-          <w:shd w:val="clear" w:color="auto" w:fill="FFFFFF"/>
-        </w:rPr>
-        <w:t>疫</w:t>
-      </w:r>
-      <w:proofErr w:type="gramEnd"/>
-      <w:r>
-        <w:rPr>
-          <w:rFonts w:ascii="微软雅黑" w:eastAsia="微软雅黑" w:hAnsi="微软雅黑" w:cs="微软雅黑" w:hint="eastAsia"/>
-          <w:color w:val="1A1A1A"/>
-          <w:sz w:val="27"/>
-          <w:szCs w:val="27"/>
-          <w:shd w:val="clear" w:color="auto" w:fill="FFFFFF"/>
-        </w:rPr>
-        <w:t>勇士临危不惧、视死如归，困难面前</w:t>
-      </w:r>
-      <w:proofErr w:type="gramStart"/>
-      <w:r>
-        <w:rPr>
-          <w:rFonts w:ascii="微软雅黑" w:eastAsia="微软雅黑" w:hAnsi="微软雅黑" w:cs="微软雅黑" w:hint="eastAsia"/>
-          <w:color w:val="1A1A1A"/>
-          <w:sz w:val="27"/>
-          <w:szCs w:val="27"/>
-          <w:shd w:val="clear" w:color="auto" w:fill="FFFFFF"/>
-        </w:rPr>
-        <w:t>豁</w:t>
-      </w:r>
-      <w:proofErr w:type="gramEnd"/>
-      <w:r>
-        <w:rPr>
-          <w:rFonts w:ascii="微软雅黑" w:eastAsia="微软雅黑" w:hAnsi="微软雅黑" w:cs="微软雅黑" w:hint="eastAsia"/>
-          <w:color w:val="1A1A1A"/>
-          <w:sz w:val="27"/>
-          <w:szCs w:val="27"/>
-          <w:shd w:val="clear" w:color="auto" w:fill="FFFFFF"/>
-        </w:rPr>
-        <w:t>得出、关键时刻冲得上，以</w:t>
-      </w:r>
-      <w:proofErr w:type="gramStart"/>
-      <w:r>
-        <w:rPr>
-          <w:rFonts w:ascii="微软雅黑" w:eastAsia="微软雅黑" w:hAnsi="微软雅黑" w:cs="微软雅黑" w:hint="eastAsia"/>
-          <w:color w:val="1A1A1A"/>
-          <w:sz w:val="27"/>
-          <w:szCs w:val="27"/>
-          <w:shd w:val="clear" w:color="auto" w:fill="FFFFFF"/>
-        </w:rPr>
-        <w:t>生命赴使命</w:t>
-      </w:r>
-      <w:proofErr w:type="gramEnd"/>
-      <w:r>
-        <w:rPr>
-          <w:rFonts w:ascii="微软雅黑" w:eastAsia="微软雅黑" w:hAnsi="微软雅黑" w:cs="微软雅黑" w:hint="eastAsia"/>
-          <w:color w:val="1A1A1A"/>
-          <w:sz w:val="27"/>
-          <w:szCs w:val="27"/>
-          <w:shd w:val="clear" w:color="auto" w:fill="FFFFFF"/>
-        </w:rPr>
-        <w:t>，用大爱护众生。他们中间，有把生的希望留给他人而自己错过救治的医院院长，有永远无法向妻子兑现婚礼承诺的丈夫，也有牺牲在救治岗位留下幼小孩子的妈妈……中华民族能够经历无数灾厄仍不断发展壮大，从来都不是因为有救世主，而是因为在大灾大难前有千千万万个普通人挺身而出、慷慨前行！</w:t>
-      </w:r>
-    </w:p>
-    <w:p>
-      <w:pPr>
-        <w:pStyle w:val="a3"/>
-        <w:shd w:val="clear" w:color="auto" w:fill="FFFFFF"/>
-        <w:spacing w:beforeLines="50" w:before="156" w:beforeAutospacing="0" w:after="0" w:afterAutospacing="0" w:line="630" w:lineRule="atLeast"/>
-        <w:jc w:val="both"/>
-        <w:rPr>
-          <w:rFonts w:ascii="微软雅黑" w:eastAsia="微软雅黑" w:hAnsi="微软雅黑" w:cs="微软雅黑" w:hint="eastAsia"/>
-          <w:color w:val="1A1A1A"/>
-          <w:sz w:val="27"/>
-          <w:szCs w:val="27"/>
-          <w:shd w:val="clear" w:color="auto" w:fill="FFFFFF"/>
-        </w:rPr>
-      </w:pPr>
-      <w:r>
-        <w:rPr>
-          <w:rFonts w:ascii="微软雅黑" w:eastAsia="微软雅黑" w:hAnsi="微软雅黑" w:cs="微软雅黑" w:hint="eastAsia"/>
-          <w:color w:val="1A1A1A"/>
-          <w:sz w:val="27"/>
-          <w:szCs w:val="27"/>
-          <w:shd w:val="clear" w:color="auto" w:fill="FFFFFF"/>
-        </w:rPr>
-        <w:t xml:space="preserve">　　——尊重科学，集中体现了中国人民求真务实、开拓创新的实践品格。面对前所未知的新型传染性疾病，中国秉持科学精神、科学态度，在没有特效药的情况下，实行中西医结合，先后推出八版全国新冠肺炎诊疗方案，筛选出“三药三方”等临床有效的中药西药和治疗办法，被多个国家借鉴和使用。无论是抢建方舱医院，还是多条技术路线研发疫苗；无论是开展大规模核酸检测和健康码识别，还是有序推进复工复产，都是对科学精神的尊崇和弘扬，都为战胜疫情提供了强大科技支撑！</w:t>
+        <w:t xml:space="preserve">　　——尊重科学，集中体现了中国人民求真务实、开拓创新的实践品格。无论是抢建方舱医院，还是多条技术路线研发疫苗；无论是开展大规模核酸检测和健康码识别，还是有序推进复工复产，都是对科学精神的尊崇和弘扬，都为战胜疫情提供了强大科技支撑！</w:t>
       </w:r>
     </w:p>
     <w:p>
@@ -726,71 +434,26 @@
     </w:p>
     <w:p>
       <w:pPr>
-        <w:pStyle w:val="a3"/>
-        <w:shd w:val="clear" w:color="auto" w:fill="FFFFFF"/>
-        <w:spacing w:beforeLines="50" w:before="156" w:beforeAutospacing="0" w:after="0" w:afterAutospacing="0" w:line="630" w:lineRule="atLeast"/>
-        <w:ind w:firstLine="540"/>
-        <w:jc w:val="both"/>
-        <w:rPr>
-          <w:rFonts w:ascii="微软雅黑" w:eastAsia="微软雅黑" w:hAnsi="微软雅黑" w:cs="微软雅黑" w:hint="eastAsia"/>
-          <w:color w:val="1A1A1A"/>
+        <w:spacing w:beforeLines="50" w:before="156"/>
+        <w:rPr>
+          <w:rFonts w:ascii="微软雅黑" w:eastAsia="微软雅黑" w:hAnsi="微软雅黑" w:cs="微软雅黑" w:hint="eastAsia"/>
+          <w:color w:val="1A1A1A"/>
+          <w:kern w:val="0"/>
           <w:sz w:val="27"/>
           <w:szCs w:val="27"/>
           <w:shd w:val="clear" w:color="auto" w:fill="FFFFFF"/>
         </w:rPr>
       </w:pPr>
-    </w:p>
-    <w:p>
-      <w:pPr>
-        <w:numPr>
-          <w:ilvl w:val="0"/>
-          <w:numId w:val="1"/>
-        </w:numPr>
-        <w:spacing w:beforeLines="50" w:before="156"/>
-        <w:rPr>
-          <w:rFonts w:ascii="微软雅黑" w:eastAsia="微软雅黑" w:hAnsi="微软雅黑" w:cs="微软雅黑" w:hint="eastAsia"/>
-          <w:color w:val="1A1A1A"/>
-          <w:kern w:val="0"/>
-          <w:sz w:val="27"/>
-          <w:szCs w:val="27"/>
-          <w:shd w:val="clear" w:color="auto" w:fill="FFFFFF"/>
-        </w:rPr>
-      </w:pPr>
-      <w:r>
-        <w:rPr>
-          <w:rFonts w:ascii="微软雅黑" w:eastAsia="微软雅黑" w:hAnsi="微软雅黑" w:cs="微软雅黑" w:hint="eastAsia"/>
-          <w:color w:val="1A1A1A"/>
-          <w:kern w:val="0"/>
-          <w:sz w:val="27"/>
-          <w:szCs w:val="27"/>
-          <w:shd w:val="clear" w:color="auto" w:fill="FFFFFF"/>
-        </w:rPr>
-        <w:lastRenderedPageBreak/>
-        <w:t>伟大抗</w:t>
-      </w:r>
-      <w:proofErr w:type="gramStart"/>
-      <w:r>
-        <w:rPr>
-          <w:rFonts w:ascii="微软雅黑" w:eastAsia="微软雅黑" w:hAnsi="微软雅黑" w:cs="微软雅黑" w:hint="eastAsia"/>
-          <w:color w:val="1A1A1A"/>
-          <w:kern w:val="0"/>
-          <w:sz w:val="27"/>
-          <w:szCs w:val="27"/>
-          <w:shd w:val="clear" w:color="auto" w:fill="FFFFFF"/>
-        </w:rPr>
-        <w:t>疫</w:t>
-      </w:r>
-      <w:proofErr w:type="gramEnd"/>
-      <w:r>
-        <w:rPr>
-          <w:rFonts w:ascii="微软雅黑" w:eastAsia="微软雅黑" w:hAnsi="微软雅黑" w:cs="微软雅黑" w:hint="eastAsia"/>
-          <w:color w:val="1A1A1A"/>
-          <w:kern w:val="0"/>
-          <w:sz w:val="27"/>
-          <w:szCs w:val="27"/>
-          <w:shd w:val="clear" w:color="auto" w:fill="FFFFFF"/>
-        </w:rPr>
-        <w:t>精神的时代价值</w:t>
+      <w:r>
+        <w:rPr>
+          <w:rFonts w:ascii="微软雅黑" w:eastAsia="微软雅黑" w:hAnsi="微软雅黑" w:cs="微软雅黑" w:hint="eastAsia"/>
+          <w:color w:val="1A1A1A"/>
+          <w:kern w:val="0"/>
+          <w:sz w:val="27"/>
+          <w:szCs w:val="27"/>
+          <w:shd w:val="clear" w:color="auto" w:fill="FFFFFF"/>
+        </w:rPr>
+        <w:t xml:space="preserve">“物有甘苦，尝之者识；道有夷险，履之者知。” </w:t>
       </w:r>
     </w:p>
     <w:p>
@@ -815,31 +478,6 @@
           <w:szCs w:val="27"/>
           <w:shd w:val="clear" w:color="auto" w:fill="FFFFFF"/>
         </w:rPr>
-        <w:t xml:space="preserve">“物有甘苦，尝之者识；道有夷险，履之者知。” </w:t>
-      </w:r>
-    </w:p>
-    <w:p>
-      <w:pPr>
-        <w:spacing w:beforeLines="50" w:before="156"/>
-        <w:ind w:firstLineChars="200" w:firstLine="540"/>
-        <w:rPr>
-          <w:rFonts w:ascii="微软雅黑" w:eastAsia="微软雅黑" w:hAnsi="微软雅黑" w:cs="微软雅黑" w:hint="eastAsia"/>
-          <w:color w:val="1A1A1A"/>
-          <w:kern w:val="0"/>
-          <w:sz w:val="27"/>
-          <w:szCs w:val="27"/>
-          <w:shd w:val="clear" w:color="auto" w:fill="FFFFFF"/>
-        </w:rPr>
-      </w:pPr>
-      <w:r>
-        <w:rPr>
-          <w:rFonts w:ascii="微软雅黑" w:eastAsia="微软雅黑" w:hAnsi="微软雅黑" w:cs="微软雅黑" w:hint="eastAsia"/>
-          <w:color w:val="1A1A1A"/>
-          <w:kern w:val="0"/>
-          <w:sz w:val="27"/>
-          <w:szCs w:val="27"/>
-          <w:shd w:val="clear" w:color="auto" w:fill="FFFFFF"/>
-        </w:rPr>
         <w:t>——抗</w:t>
       </w:r>
       <w:proofErr w:type="gramStart"/>
@@ -864,55 +502,19 @@
           <w:szCs w:val="27"/>
           <w:shd w:val="clear" w:color="auto" w:fill="FFFFFF"/>
         </w:rPr>
-        <w:t>斗争伟大实践再次证明，中国共产党所具有的无比坚强的领导力，是风雨来袭时中国人民最可靠的主心骨。正是因为有中国共产党领导、有全国各族人民对中国共产党的拥护和支持，我们才能成功战洪水、</w:t>
-      </w:r>
-      <w:proofErr w:type="gramStart"/>
-      <w:r>
-        <w:rPr>
-          <w:rFonts w:ascii="微软雅黑" w:eastAsia="微软雅黑" w:hAnsi="微软雅黑" w:cs="微软雅黑" w:hint="eastAsia"/>
-          <w:color w:val="1A1A1A"/>
-          <w:kern w:val="0"/>
-          <w:sz w:val="27"/>
-          <w:szCs w:val="27"/>
-          <w:shd w:val="clear" w:color="auto" w:fill="FFFFFF"/>
-        </w:rPr>
-        <w:t>防非典</w:t>
-      </w:r>
-      <w:proofErr w:type="gramEnd"/>
-      <w:r>
-        <w:rPr>
-          <w:rFonts w:ascii="微软雅黑" w:eastAsia="微软雅黑" w:hAnsi="微软雅黑" w:cs="微软雅黑" w:hint="eastAsia"/>
-          <w:color w:val="1A1A1A"/>
-          <w:kern w:val="0"/>
-          <w:sz w:val="27"/>
-          <w:szCs w:val="27"/>
-          <w:shd w:val="clear" w:color="auto" w:fill="FFFFFF"/>
-        </w:rPr>
-        <w:t>、抗地震、化危机、应变局，才能打赢这次抗</w:t>
-      </w:r>
-      <w:proofErr w:type="gramStart"/>
-      <w:r>
-        <w:rPr>
-          <w:rFonts w:ascii="微软雅黑" w:eastAsia="微软雅黑" w:hAnsi="微软雅黑" w:cs="微软雅黑" w:hint="eastAsia"/>
-          <w:color w:val="1A1A1A"/>
-          <w:kern w:val="0"/>
-          <w:sz w:val="27"/>
-          <w:szCs w:val="27"/>
-          <w:shd w:val="clear" w:color="auto" w:fill="FFFFFF"/>
-        </w:rPr>
-        <w:t>疫</w:t>
-      </w:r>
-      <w:proofErr w:type="gramEnd"/>
-      <w:r>
-        <w:rPr>
-          <w:rFonts w:ascii="微软雅黑" w:eastAsia="微软雅黑" w:hAnsi="微软雅黑" w:cs="微软雅黑" w:hint="eastAsia"/>
-          <w:color w:val="1A1A1A"/>
-          <w:kern w:val="0"/>
-          <w:sz w:val="27"/>
-          <w:szCs w:val="27"/>
-          <w:shd w:val="clear" w:color="auto" w:fill="FFFFFF"/>
-        </w:rPr>
-        <w:t>斗争。历史和现实都告诉我们，只要毫不动摇坚持和加强党的全面领导，不断增强党的政治领导力、思想引领力、群众组织力、社会号召力，永远保持党同人民群众的血肉联系，我们就一定能够形成强大合力，从容应对各种复杂局面和风险挑战。</w:t>
+        <w:t>斗争伟大实践再次证明，中国共产党所具有的无比坚强的领导</w:t>
+      </w:r>
+      <w:r>
+        <w:rPr>
+          <w:rFonts w:ascii="微软雅黑" w:eastAsia="微软雅黑" w:hAnsi="微软雅黑" w:cs="微软雅黑" w:hint="eastAsia"/>
+          <w:color w:val="1A1A1A"/>
+          <w:kern w:val="0"/>
+          <w:sz w:val="27"/>
+          <w:szCs w:val="27"/>
+          <w:shd w:val="clear" w:color="auto" w:fill="FFFFFF"/>
+        </w:rPr>
+        <w:lastRenderedPageBreak/>
+        <w:t>力，是风雨来袭时中国人民最可靠的主心骨。历史和现实都告诉我们，只要毫不动摇坚持和加强党的全面领导，不断增强党的政治领导力、思想引领力、群众组织力、社会号召力，永远保持党同人民群众的血肉联系，我们就一定能够形成强大合力，从容应对各种复杂局面和风险挑战。</w:t>
       </w:r>
     </w:p>
     <w:p>
@@ -959,7 +561,7 @@
           <w:szCs w:val="27"/>
           <w:shd w:val="clear" w:color="auto" w:fill="FFFFFF"/>
         </w:rPr>
-        <w:t>斗争伟大实践再次证明，中国人民所具有的不屈不挠的意志力，是战胜前进道路上一切艰难险阻的力量源泉。苦难考验了中国人民，也锻炼了中国人民。千百年来，中国人民就以生命力的顽强、凝聚力的深厚、忍耐力的坚韧、创造力的巨大而闻名于世，我们都为自己是中国人感到骄傲和自豪！历史和现实都告诉我们，只要紧紧依靠人民、一切为了人民，充分激发广大人民顽强不屈的意志和坚忍不拔的毅力，我们就一定能够使</w:t>
+        <w:t>斗争伟大实践再次证明，中国人民所具有的不屈不挠的意志力，是战胜前进道路上一切艰难险阻的力量源泉。历史和现实都告诉我们，只要紧紧依靠人民、一切为了人民，充分激发广大人民顽强不屈的意志和坚忍不拔的毅力，我们就一定能够使</w:t>
       </w:r>
       <w:proofErr w:type="gramStart"/>
       <w:r>
@@ -1028,40 +630,7 @@
           <w:szCs w:val="27"/>
           <w:shd w:val="clear" w:color="auto" w:fill="FFFFFF"/>
         </w:rPr>
-        <w:t>斗争伟大实践再次证明，中国特色社会主义制度所具有的显著优势，是抵御风险挑战、提高国家治理效能的根本保证。衡量一个国家的制度是否成功、是否优越，一个重要方面就是看其在重大风险挑战面前，能不</w:t>
-      </w:r>
-      <w:r>
-        <w:rPr>
-          <w:rFonts w:ascii="微软雅黑" w:eastAsia="微软雅黑" w:hAnsi="微软雅黑" w:cs="微软雅黑" w:hint="eastAsia"/>
-          <w:color w:val="1A1A1A"/>
-          <w:sz w:val="27"/>
-          <w:szCs w:val="27"/>
-          <w:shd w:val="clear" w:color="auto" w:fill="FFFFFF"/>
-        </w:rPr>
-        <w:lastRenderedPageBreak/>
-        <w:t>能号令四面、组织八方共同应对。我国社会主义制度具有非凡的组织动员能力、统筹协调能力、贯彻执行能力，能够充分发挥集中力量办大事、办难事、办急事的独特优势，这次抗</w:t>
-      </w:r>
-      <w:proofErr w:type="gramStart"/>
-      <w:r>
-        <w:rPr>
-          <w:rFonts w:ascii="微软雅黑" w:eastAsia="微软雅黑" w:hAnsi="微软雅黑" w:cs="微软雅黑" w:hint="eastAsia"/>
-          <w:color w:val="1A1A1A"/>
-          <w:sz w:val="27"/>
-          <w:szCs w:val="27"/>
-          <w:shd w:val="clear" w:color="auto" w:fill="FFFFFF"/>
-        </w:rPr>
-        <w:t>疫</w:t>
-      </w:r>
-      <w:proofErr w:type="gramEnd"/>
-      <w:r>
-        <w:rPr>
-          <w:rFonts w:ascii="微软雅黑" w:eastAsia="微软雅黑" w:hAnsi="微软雅黑" w:cs="微软雅黑" w:hint="eastAsia"/>
-          <w:color w:val="1A1A1A"/>
-          <w:sz w:val="27"/>
-          <w:szCs w:val="27"/>
-          <w:shd w:val="clear" w:color="auto" w:fill="FFFFFF"/>
-        </w:rPr>
-        <w:t>斗争有力彰显了我国国家制度和国家治理体系的优越性。只要坚持和完善中国特色社会主义制度、推进国家治理体系和治理能力现代化，善于运用制度力量应对风险挑战冲击，我们就一定能够经受住一次次压力测试，不断化危为机、浴火重生。</w:t>
+        <w:t>斗争伟大实践再次证明，中国特色社会主义制度所具有的显著优势，是抵御风险挑战、提高国家治理效能的根本保证。只要坚持和完善中国特色社会主义制度、推进国家治理体系和治理能力现代化，善于运用制度力量应对风险挑战冲击，我们就一定能够经受住一次次压力测试，不断化危为机、浴火重生。</w:t>
       </w:r>
     </w:p>
     <w:p>
@@ -1108,50 +677,7 @@
           <w:szCs w:val="27"/>
           <w:shd w:val="clear" w:color="auto" w:fill="FFFFFF"/>
         </w:rPr>
-        <w:t>斗争伟大实践再次证明，构建人类命运共同体所具有的广泛感召力，是应对人类共同挑战、建设更加繁荣美好世界的人间正道。</w:t>
-      </w:r>
-    </w:p>
-    <w:p>
-      <w:pPr>
-        <w:pStyle w:val="a3"/>
-        <w:shd w:val="clear" w:color="auto" w:fill="FFFFFF"/>
-        <w:spacing w:beforeLines="50" w:before="156" w:beforeAutospacing="0" w:after="0" w:afterAutospacing="0" w:line="630" w:lineRule="atLeast"/>
-        <w:jc w:val="both"/>
-        <w:rPr>
-          <w:rFonts w:ascii="微软雅黑" w:eastAsia="微软雅黑" w:hAnsi="微软雅黑" w:cs="微软雅黑" w:hint="eastAsia"/>
-          <w:color w:val="1A1A1A"/>
-          <w:sz w:val="27"/>
-          <w:szCs w:val="27"/>
-          <w:shd w:val="clear" w:color="auto" w:fill="FFFFFF"/>
-        </w:rPr>
-      </w:pPr>
-      <w:r>
-        <w:rPr>
-          <w:rFonts w:ascii="微软雅黑" w:eastAsia="微软雅黑" w:hAnsi="微软雅黑" w:cs="微软雅黑" w:hint="eastAsia"/>
-          <w:color w:val="1A1A1A"/>
-          <w:sz w:val="27"/>
-          <w:szCs w:val="27"/>
-          <w:shd w:val="clear" w:color="auto" w:fill="FFFFFF"/>
-        </w:rPr>
-        <w:t>新冠肺炎疫情以一种特殊形式告诫世人，任何自私自利、嫁祸他人、颠倒是非、混淆黑白的做法，不仅会对本国和本国人民造成伤害，而且会给世界各国人民带来伤害。只要国际社会秉持人类命运共同体理念，坚持多边主义、走团结合作之路，世界各国人民就一定能够携手应对各种全球性问题，共建美好地球家园。</w:t>
-      </w:r>
-    </w:p>
-    <w:p>
-      <w:pPr>
-        <w:spacing w:beforeLines="50" w:before="156"/>
-        <w:rPr>
-          <w:rFonts w:ascii="方正黑体简体" w:eastAsia="方正黑体简体" w:hAnsi="方正黑体简体" w:hint="eastAsia"/>
-          <w:sz w:val="44"/>
-          <w:szCs w:val="44"/>
-        </w:rPr>
-      </w:pPr>
-      <w:r>
-        <w:rPr>
-          <w:rFonts w:ascii="方正黑体简体" w:eastAsia="方正黑体简体" w:hAnsi="方正黑体简体" w:hint="eastAsia"/>
-          <w:sz w:val="44"/>
-          <w:szCs w:val="44"/>
-        </w:rPr>
-        <w:t>结语</w:t>
+        <w:t>斗争伟大实践再次证明，构建人类命运共同体所具有的广泛感召力，是应对人类共同挑战、建设更加繁荣美好世界的人间正道。只要国际社会秉持人类命运共同体理念，坚持多边主义、走团结合作之路，世界各国人民就一定能够携手应对各种全球性问题，共建美好地球家园。</w:t>
       </w:r>
     </w:p>
     <w:p>
@@ -1176,59 +702,22 @@
           <w:szCs w:val="27"/>
           <w:shd w:val="clear" w:color="auto" w:fill="FFFFFF"/>
         </w:rPr>
-        <w:t>砥砺于磨难，成长于斗争。伟大的抗</w:t>
-      </w:r>
-      <w:proofErr w:type="gramStart"/>
-      <w:r>
-        <w:rPr>
-          <w:rFonts w:ascii="微软雅黑" w:eastAsia="微软雅黑" w:hAnsi="微软雅黑" w:cs="微软雅黑" w:hint="eastAsia"/>
-          <w:color w:val="1A1A1A"/>
-          <w:kern w:val="0"/>
-          <w:sz w:val="27"/>
-          <w:szCs w:val="27"/>
-          <w:shd w:val="clear" w:color="auto" w:fill="FFFFFF"/>
-        </w:rPr>
-        <w:t>疫</w:t>
-      </w:r>
-      <w:proofErr w:type="gramEnd"/>
-      <w:r>
-        <w:rPr>
-          <w:rFonts w:ascii="微软雅黑" w:eastAsia="微软雅黑" w:hAnsi="微软雅黑" w:cs="微软雅黑" w:hint="eastAsia"/>
-          <w:color w:val="1A1A1A"/>
-          <w:kern w:val="0"/>
-          <w:sz w:val="27"/>
-          <w:szCs w:val="27"/>
-          <w:shd w:val="clear" w:color="auto" w:fill="FFFFFF"/>
-        </w:rPr>
-        <w:t>斗争，让我们更加自豪——中华民族是历经磨难、不屈不挠的伟大民族，中国人民是勤劳勇敢、自强不息的伟大人民，中国共产党是敢于斗争、敢于胜利的伟大政党。伟大的抗</w:t>
-      </w:r>
-      <w:proofErr w:type="gramStart"/>
-      <w:r>
-        <w:rPr>
-          <w:rFonts w:ascii="微软雅黑" w:eastAsia="微软雅黑" w:hAnsi="微软雅黑" w:cs="微软雅黑" w:hint="eastAsia"/>
-          <w:color w:val="1A1A1A"/>
-          <w:kern w:val="0"/>
-          <w:sz w:val="27"/>
-          <w:szCs w:val="27"/>
-          <w:shd w:val="clear" w:color="auto" w:fill="FFFFFF"/>
-        </w:rPr>
-        <w:t>疫</w:t>
-      </w:r>
-      <w:proofErr w:type="gramEnd"/>
-      <w:r>
-        <w:rPr>
-          <w:rFonts w:ascii="微软雅黑" w:eastAsia="微软雅黑" w:hAnsi="微软雅黑" w:cs="微软雅黑" w:hint="eastAsia"/>
-          <w:color w:val="1A1A1A"/>
-          <w:kern w:val="0"/>
-          <w:sz w:val="27"/>
-          <w:szCs w:val="27"/>
-          <w:shd w:val="clear" w:color="auto" w:fill="FFFFFF"/>
-        </w:rPr>
-        <w:t>斗争，让我们更加警醒——前路并非坦途，中华民族伟大复兴绝不是轻轻松松、敲</w:t>
-      </w:r>
-      <w:r>
-        <w:rPr>
-          <w:rFonts w:ascii="微软雅黑" w:eastAsia="微软雅黑" w:hAnsi="微软雅黑" w:cs="微软雅黑" w:hint="eastAsia"/>
+        <w:t>砥砺于磨难，成长于斗争。</w:t>
+      </w:r>
+      <w:r>
+        <w:rPr>
+          <w:rFonts w:ascii="微软雅黑" w:eastAsia="微软雅黑" w:hAnsi="微软雅黑" w:cs="微软雅黑"/>
+          <w:color w:val="1A1A1A"/>
+          <w:kern w:val="0"/>
+          <w:sz w:val="27"/>
+          <w:szCs w:val="27"/>
+          <w:shd w:val="clear" w:color="auto" w:fill="FFFFFF"/>
+        </w:rPr>
+        <w:t>“天行健，君子以自强不息。”一个民族之</w:t>
+      </w:r>
+      <w:r>
+        <w:rPr>
+          <w:rFonts w:ascii="微软雅黑" w:eastAsia="微软雅黑" w:hAnsi="微软雅黑" w:cs="微软雅黑"/>
           <w:color w:val="1A1A1A"/>
           <w:kern w:val="0"/>
           <w:sz w:val="27"/>
@@ -1236,7 +725,29 @@
           <w:shd w:val="clear" w:color="auto" w:fill="FFFFFF"/>
         </w:rPr>
         <w:lastRenderedPageBreak/>
-        <w:t>锣打鼓就能实现的，必须准备付出更为艰苦的努力。</w:t>
+        <w:t>所以伟大，根本就在于在任何困难和风险面前都从来不放弃、不退缩、不止步，百折不挠为自己的前途命运而奋斗。</w:t>
+      </w:r>
+      <w:r>
+        <w:rPr>
+          <w:rFonts w:ascii="微软雅黑" w:eastAsia="微软雅黑" w:hAnsi="微软雅黑" w:cs="微软雅黑" w:hint="eastAsia"/>
+          <w:color w:val="1A1A1A"/>
+          <w:kern w:val="0"/>
+          <w:sz w:val="27"/>
+          <w:szCs w:val="27"/>
+          <w:shd w:val="clear" w:color="auto" w:fill="FFFFFF"/>
+        </w:rPr>
+        <w:t>中华民族伟大复兴绝不是轻轻松松、敲锣打鼓就能实现的，必须准备付出更为艰苦的努力</w:t>
+      </w:r>
+      <w:r>
+        <w:rPr>
+          <w:rFonts w:ascii="微软雅黑" w:eastAsia="微软雅黑" w:hAnsi="微软雅黑" w:cs="微软雅黑" w:hint="eastAsia"/>
+          <w:color w:val="1A1A1A"/>
+          <w:kern w:val="0"/>
+          <w:sz w:val="27"/>
+          <w:szCs w:val="27"/>
+          <w:shd w:val="clear" w:color="auto" w:fill="FFFFFF"/>
+        </w:rPr>
+        <w:t>。</w:t>
       </w:r>
       <w:r>
         <w:rPr>
@@ -1247,14 +758,14 @@
           <w:szCs w:val="27"/>
           <w:shd w:val="clear" w:color="auto" w:fill="FFFFFF"/>
         </w:rPr>
-        <w:t>“天行健，君子以自强不息。”一个民族之所以伟大，根本就在于在任何困难和风险面前都从来不放弃、不退缩、不止步，百折不挠为自己的前途命运而奋斗。从5000多年文明发展的苦难辉煌中走来的中国人民和中华民族，必将在新时代的伟大征程上一路向前，任何人任何势力都不能阻挡中国人民实现更加美好生活的前进步伐！</w:t>
+        <w:t>中国人民和中华民族，必将在新时代的伟大征程上一路向前，任何人任何势力都不能阻挡中国人民实现更加美好生活的前进步伐！</w:t>
       </w:r>
     </w:p>
     <w:p>
       <w:pPr>
         <w:spacing w:beforeLines="50" w:before="156"/>
         <w:rPr>
-          <w:rFonts w:ascii="微软雅黑" w:eastAsia="微软雅黑" w:hAnsi="微软雅黑" w:cs="微软雅黑" w:hint="eastAsia"/>
+          <w:rFonts w:ascii="微软雅黑" w:eastAsia="微软雅黑" w:hAnsi="微软雅黑" w:cs="微软雅黑"/>
           <w:color w:val="1A1A1A"/>
           <w:kern w:val="0"/>
           <w:sz w:val="27"/>
@@ -1273,109 +784,6 @@
         </w:rPr>
         <w:t>我的分享完毕，谢谢大家。在此感谢小组同学做出的努力。感谢他们的付出。</w:t>
       </w:r>
-    </w:p>
-    <w:p>
-      <w:pPr>
-        <w:spacing w:beforeLines="50" w:before="156"/>
-        <w:rPr>
-          <w:rFonts w:ascii="微软雅黑" w:eastAsia="微软雅黑" w:hAnsi="微软雅黑" w:cs="微软雅黑" w:hint="eastAsia"/>
-          <w:color w:val="A6A6A6" w:themeColor="background1" w:themeShade="A6"/>
-          <w:kern w:val="0"/>
-          <w:sz w:val="27"/>
-          <w:szCs w:val="27"/>
-          <w:shd w:val="clear" w:color="auto" w:fill="FFFFFF"/>
-        </w:rPr>
-      </w:pPr>
-      <w:r>
-        <w:rPr>
-          <w:rFonts w:ascii="微软雅黑" w:eastAsia="微软雅黑" w:hAnsi="微软雅黑" w:cs="微软雅黑" w:hint="eastAsia"/>
-          <w:color w:val="A6A6A6" w:themeColor="background1" w:themeShade="A6"/>
-          <w:kern w:val="0"/>
-          <w:sz w:val="27"/>
-          <w:szCs w:val="27"/>
-          <w:shd w:val="clear" w:color="auto" w:fill="FFFFFF"/>
-        </w:rPr>
-        <w:t>(不想念名字就大约等他们眼扫过一遍就点ppt</w:t>
-      </w:r>
-      <w:proofErr w:type="gramStart"/>
-      <w:r>
-        <w:rPr>
-          <w:rFonts w:ascii="微软雅黑" w:eastAsia="微软雅黑" w:hAnsi="微软雅黑" w:cs="微软雅黑" w:hint="eastAsia"/>
-          <w:color w:val="A6A6A6" w:themeColor="background1" w:themeShade="A6"/>
-          <w:kern w:val="0"/>
-          <w:sz w:val="27"/>
-          <w:szCs w:val="27"/>
-          <w:shd w:val="clear" w:color="auto" w:fill="FFFFFF"/>
-        </w:rPr>
-        <w:t>到尾页</w:t>
-      </w:r>
-      <w:proofErr w:type="gramEnd"/>
-      <w:r>
-        <w:rPr>
-          <w:rFonts w:ascii="微软雅黑" w:eastAsia="微软雅黑" w:hAnsi="微软雅黑" w:cs="微软雅黑" w:hint="eastAsia"/>
-          <w:color w:val="A6A6A6" w:themeColor="background1" w:themeShade="A6"/>
-          <w:kern w:val="0"/>
-          <w:sz w:val="27"/>
-          <w:szCs w:val="27"/>
-          <w:shd w:val="clear" w:color="auto" w:fill="FFFFFF"/>
-        </w:rPr>
-        <w:t>)</w:t>
-      </w:r>
-    </w:p>
-    <w:p>
-      <w:pPr>
-        <w:spacing w:beforeLines="50" w:before="156"/>
-        <w:rPr>
-          <w:rFonts w:ascii="微软雅黑" w:eastAsia="微软雅黑" w:hAnsi="微软雅黑" w:cs="微软雅黑" w:hint="eastAsia"/>
-          <w:color w:val="A6A6A6" w:themeColor="background1" w:themeShade="A6"/>
-          <w:kern w:val="0"/>
-          <w:sz w:val="27"/>
-          <w:szCs w:val="27"/>
-          <w:shd w:val="clear" w:color="auto" w:fill="FFFFFF"/>
-        </w:rPr>
-      </w:pPr>
-      <w:r>
-        <w:rPr>
-          <w:rFonts w:ascii="微软雅黑" w:eastAsia="微软雅黑" w:hAnsi="微软雅黑" w:cs="微软雅黑" w:hint="eastAsia"/>
-          <w:color w:val="A6A6A6" w:themeColor="background1" w:themeShade="A6"/>
-          <w:kern w:val="0"/>
-          <w:sz w:val="27"/>
-          <w:szCs w:val="27"/>
-          <w:shd w:val="clear" w:color="auto" w:fill="FFFFFF"/>
-        </w:rPr>
-        <w:t>(最好稍微</w:t>
-      </w:r>
-      <w:proofErr w:type="gramStart"/>
-      <w:r>
-        <w:rPr>
-          <w:rFonts w:ascii="微软雅黑" w:eastAsia="微软雅黑" w:hAnsi="微软雅黑" w:cs="微软雅黑" w:hint="eastAsia"/>
-          <w:color w:val="A6A6A6" w:themeColor="background1" w:themeShade="A6"/>
-          <w:kern w:val="0"/>
-          <w:sz w:val="27"/>
-          <w:szCs w:val="27"/>
-          <w:shd w:val="clear" w:color="auto" w:fill="FFFFFF"/>
-        </w:rPr>
-        <w:t>鞠</w:t>
-      </w:r>
-      <w:proofErr w:type="gramEnd"/>
-      <w:r>
-        <w:rPr>
-          <w:rFonts w:ascii="微软雅黑" w:eastAsia="微软雅黑" w:hAnsi="微软雅黑" w:cs="微软雅黑" w:hint="eastAsia"/>
-          <w:color w:val="A6A6A6" w:themeColor="background1" w:themeShade="A6"/>
-          <w:kern w:val="0"/>
-          <w:sz w:val="27"/>
-          <w:szCs w:val="27"/>
-          <w:shd w:val="clear" w:color="auto" w:fill="FFFFFF"/>
-        </w:rPr>
-        <w:t>鞠躬)</w:t>
-      </w:r>
-    </w:p>
-    <w:p>
-      <w:pPr>
-        <w:rPr>
-          <w:rFonts w:hint="eastAsia"/>
-        </w:rPr>
-      </w:pPr>
     </w:p>
     <w:sectPr>
       <w:pgSz w:w="11906" w:h="16838"/>
@@ -1875,7 +1283,6 @@
   <w:style w:type="character" w:default="1" w:styleId="a0">
     <w:name w:val="Default Paragraph Font"/>
     <w:uiPriority w:val="1"/>
-    <w:semiHidden/>
     <w:unhideWhenUsed/>
   </w:style>
   <w:style w:type="table" w:default="1" w:styleId="a1">

</xml_diff>